<commit_message>
Modification date, heure, prix
</commit_message>
<xml_diff>
--- a/APEL-2025-2026-kermesse.docx
+++ b/APEL-2025-2026-kermesse.docx
@@ -6,6 +6,186 @@
       <w:pPr>
         <w:jc w:val="both"/>
       </w:pPr>
+      <w:r>
+        <w:rPr>
+          <w:noProof/>
+        </w:rPr>
+        <w:drawing>
+          <wp:anchor distT="0" distB="0" distL="114300" distR="114300" simplePos="0" relativeHeight="251672576" behindDoc="1" locked="0" layoutInCell="1" allowOverlap="1" wp14:anchorId="68D11E9D" wp14:editId="4269FFD3">
+            <wp:simplePos x="0" y="0"/>
+            <wp:positionH relativeFrom="margin">
+              <wp:posOffset>6074410</wp:posOffset>
+            </wp:positionH>
+            <wp:positionV relativeFrom="paragraph">
+              <wp:posOffset>9362440</wp:posOffset>
+            </wp:positionV>
+            <wp:extent cx="1064260" cy="769620"/>
+            <wp:effectExtent l="0" t="0" r="2540" b="0"/>
+            <wp:wrapNone/>
+            <wp:docPr id="7" name="Image 7" descr="Une image contenant texte, fleur, Graphique, Police&#10;&#10;Description générée automatiquement"/>
+            <wp:cNvGraphicFramePr>
+              <a:graphicFrameLocks xmlns:a="http://schemas.openxmlformats.org/drawingml/2006/main" noChangeAspect="1"/>
+            </wp:cNvGraphicFramePr>
+            <a:graphic xmlns:a="http://schemas.openxmlformats.org/drawingml/2006/main">
+              <a:graphicData uri="http://schemas.openxmlformats.org/drawingml/2006/picture">
+                <pic:pic xmlns:pic="http://schemas.openxmlformats.org/drawingml/2006/picture">
+                  <pic:nvPicPr>
+                    <pic:cNvPr id="7" name="Image 7" descr="Une image contenant texte, fleur, Graphique, Police&#10;&#10;Description générée automatiquement"/>
+                    <pic:cNvPicPr/>
+                  </pic:nvPicPr>
+                  <pic:blipFill>
+                    <a:blip r:embed="rId6">
+                      <a:extLst>
+                        <a:ext uri="{28A0092B-C50C-407E-A947-70E740481C1C}">
+                          <a14:useLocalDpi xmlns:a14="http://schemas.microsoft.com/office/drawing/2010/main" val="0"/>
+                        </a:ext>
+                      </a:extLst>
+                    </a:blip>
+                    <a:stretch>
+                      <a:fillRect/>
+                    </a:stretch>
+                  </pic:blipFill>
+                  <pic:spPr>
+                    <a:xfrm>
+                      <a:off x="0" y="0"/>
+                      <a:ext cx="1064260" cy="769620"/>
+                    </a:xfrm>
+                    <a:prstGeom prst="rect">
+                      <a:avLst/>
+                    </a:prstGeom>
+                  </pic:spPr>
+                </pic:pic>
+              </a:graphicData>
+            </a:graphic>
+            <wp14:sizeRelH relativeFrom="page">
+              <wp14:pctWidth>0</wp14:pctWidth>
+            </wp14:sizeRelH>
+            <wp14:sizeRelV relativeFrom="page">
+              <wp14:pctHeight>0</wp14:pctHeight>
+            </wp14:sizeRelV>
+          </wp:anchor>
+        </w:drawing>
+      </w:r>
+      <w:r>
+        <w:rPr>
+          <w:noProof/>
+        </w:rPr>
+        <w:drawing>
+          <wp:anchor distT="0" distB="0" distL="114300" distR="114300" simplePos="0" relativeHeight="251671552" behindDoc="1" locked="0" layoutInCell="1" allowOverlap="1" wp14:anchorId="6EFD1B4B" wp14:editId="1104CBAA">
+            <wp:simplePos x="0" y="0"/>
+            <wp:positionH relativeFrom="margin">
+              <wp:posOffset>12700</wp:posOffset>
+            </wp:positionH>
+            <wp:positionV relativeFrom="paragraph">
+              <wp:posOffset>9366885</wp:posOffset>
+            </wp:positionV>
+            <wp:extent cx="750570" cy="750570"/>
+            <wp:effectExtent l="0" t="0" r="0" b="0"/>
+            <wp:wrapNone/>
+            <wp:docPr id="6" name="Image 6" descr="Une image contenant texte, logo, Police, symbole&#10;&#10;Description générée automatiquement"/>
+            <wp:cNvGraphicFramePr>
+              <a:graphicFrameLocks xmlns:a="http://schemas.openxmlformats.org/drawingml/2006/main" noChangeAspect="1"/>
+            </wp:cNvGraphicFramePr>
+            <a:graphic xmlns:a="http://schemas.openxmlformats.org/drawingml/2006/main">
+              <a:graphicData uri="http://schemas.openxmlformats.org/drawingml/2006/picture">
+                <pic:pic xmlns:pic="http://schemas.openxmlformats.org/drawingml/2006/picture">
+                  <pic:nvPicPr>
+                    <pic:cNvPr id="6" name="Image 6" descr="Une image contenant texte, logo, Police, symbole&#10;&#10;Description générée automatiquement"/>
+                    <pic:cNvPicPr/>
+                  </pic:nvPicPr>
+                  <pic:blipFill>
+                    <a:blip r:embed="rId7" cstate="print">
+                      <a:extLst>
+                        <a:ext uri="{28A0092B-C50C-407E-A947-70E740481C1C}">
+                          <a14:useLocalDpi xmlns:a14="http://schemas.microsoft.com/office/drawing/2010/main" val="0"/>
+                        </a:ext>
+                      </a:extLst>
+                    </a:blip>
+                    <a:stretch>
+                      <a:fillRect/>
+                    </a:stretch>
+                  </pic:blipFill>
+                  <pic:spPr>
+                    <a:xfrm>
+                      <a:off x="0" y="0"/>
+                      <a:ext cx="750570" cy="750570"/>
+                    </a:xfrm>
+                    <a:prstGeom prst="rect">
+                      <a:avLst/>
+                    </a:prstGeom>
+                  </pic:spPr>
+                </pic:pic>
+              </a:graphicData>
+            </a:graphic>
+            <wp14:sizeRelH relativeFrom="page">
+              <wp14:pctWidth>0</wp14:pctWidth>
+            </wp14:sizeRelH>
+            <wp14:sizeRelV relativeFrom="page">
+              <wp14:pctHeight>0</wp14:pctHeight>
+            </wp14:sizeRelV>
+          </wp:anchor>
+        </w:drawing>
+      </w:r>
+      <w:r>
+        <w:rPr>
+          <w:noProof/>
+        </w:rPr>
+        <w:drawing>
+          <wp:anchor distT="0" distB="0" distL="114300" distR="114300" simplePos="0" relativeHeight="251658240" behindDoc="1" locked="0" layoutInCell="1" allowOverlap="1" wp14:anchorId="171E41C9" wp14:editId="76636F0E">
+            <wp:simplePos x="0" y="0"/>
+            <wp:positionH relativeFrom="page">
+              <wp:posOffset>-2540</wp:posOffset>
+            </wp:positionH>
+            <wp:positionV relativeFrom="paragraph">
+              <wp:posOffset>-207645</wp:posOffset>
+            </wp:positionV>
+            <wp:extent cx="7562850" cy="10688320"/>
+            <wp:effectExtent l="0" t="0" r="0" b="0"/>
+            <wp:wrapNone/>
+            <wp:docPr id="3" name="Image 3"/>
+            <wp:cNvGraphicFramePr>
+              <a:graphicFrameLocks xmlns:a="http://schemas.openxmlformats.org/drawingml/2006/main" noChangeAspect="1"/>
+            </wp:cNvGraphicFramePr>
+            <a:graphic xmlns:a="http://schemas.openxmlformats.org/drawingml/2006/main">
+              <a:graphicData uri="http://schemas.openxmlformats.org/drawingml/2006/picture">
+                <pic:pic xmlns:pic="http://schemas.openxmlformats.org/drawingml/2006/picture">
+                  <pic:nvPicPr>
+                    <pic:cNvPr id="3" name="Image 3"/>
+                    <pic:cNvPicPr/>
+                  </pic:nvPicPr>
+                  <pic:blipFill>
+                    <a:blip r:embed="rId8">
+                      <a:extLst>
+                        <a:ext uri="{28A0092B-C50C-407E-A947-70E740481C1C}">
+                          <a14:useLocalDpi xmlns:a14="http://schemas.microsoft.com/office/drawing/2010/main" val="0"/>
+                        </a:ext>
+                      </a:extLst>
+                    </a:blip>
+                    <a:stretch>
+                      <a:fillRect/>
+                    </a:stretch>
+                  </pic:blipFill>
+                  <pic:spPr>
+                    <a:xfrm>
+                      <a:off x="0" y="0"/>
+                      <a:ext cx="7562850" cy="10688320"/>
+                    </a:xfrm>
+                    <a:prstGeom prst="rect">
+                      <a:avLst/>
+                    </a:prstGeom>
+                  </pic:spPr>
+                </pic:pic>
+              </a:graphicData>
+            </a:graphic>
+            <wp14:sizeRelH relativeFrom="page">
+              <wp14:pctWidth>0</wp14:pctWidth>
+            </wp14:sizeRelH>
+            <wp14:sizeRelV relativeFrom="page">
+              <wp14:pctHeight>0</wp14:pctHeight>
+            </wp14:sizeRelV>
+          </wp:anchor>
+        </w:drawing>
+      </w:r>
       <w:r>
         <w:rPr>
           <w:noProof/>
@@ -13,7 +193,7 @@
         <mc:AlternateContent>
           <mc:Choice Requires="wps">
             <w:drawing>
-              <wp:anchor distT="91440" distB="91440" distL="137160" distR="137160" simplePos="0" relativeHeight="251666432" behindDoc="0" locked="0" layoutInCell="0" allowOverlap="1" wp14:anchorId="243FC632" wp14:editId="166B4253">
+              <wp:anchor distT="91440" distB="91440" distL="137160" distR="137160" simplePos="0" relativeHeight="251666432" behindDoc="0" locked="0" layoutInCell="0" allowOverlap="1" wp14:anchorId="243FC632" wp14:editId="1B98C2D5">
                 <wp:simplePos x="0" y="0"/>
                 <wp:positionH relativeFrom="margin">
                   <wp:posOffset>2354580</wp:posOffset>
@@ -98,7 +278,37 @@
                                 <w:sz w:val="40"/>
                                 <w:szCs w:val="40"/>
                               </w:rPr>
-                              <w:t>Vendredi 19 juin 2026 – 17h</w:t>
+                              <w:t>Vendredi 19 juin 2026 – 1</w:t>
+                            </w:r>
+                            <w:r>
+                              <w:rPr>
+                                <w:rFonts w:ascii="Comic Sans MS" w:hAnsi="Comic Sans MS"/>
+                                <w:b/>
+                                <w:bCs/>
+                                <w:sz w:val="40"/>
+                                <w:szCs w:val="40"/>
+                              </w:rPr>
+                              <w:t>6</w:t>
+                            </w:r>
+                            <w:r>
+                              <w:rPr>
+                                <w:rFonts w:ascii="Comic Sans MS" w:hAnsi="Comic Sans MS"/>
+                                <w:b/>
+                                <w:bCs/>
+                                <w:sz w:val="40"/>
+                                <w:szCs w:val="40"/>
+                              </w:rPr>
+                              <w:t>h</w:t>
+                            </w:r>
+                            <w:r>
+                              <w:rPr>
+                                <w:rFonts w:ascii="Comic Sans MS" w:hAnsi="Comic Sans MS"/>
+                                <w:b/>
+                                <w:bCs/>
+                                <w:sz w:val="40"/>
+                                <w:szCs w:val="40"/>
+                              </w:rPr>
+                              <w:t>30</w:t>
                             </w:r>
                           </w:p>
                         </w:txbxContent>
@@ -165,7 +375,37 @@
                           <w:sz w:val="40"/>
                           <w:szCs w:val="40"/>
                         </w:rPr>
-                        <w:t>Vendredi 19 juin 2026 – 17h</w:t>
+                        <w:t>Vendredi 19 juin 2026 – 1</w:t>
+                      </w:r>
+                      <w:r>
+                        <w:rPr>
+                          <w:rFonts w:ascii="Comic Sans MS" w:hAnsi="Comic Sans MS"/>
+                          <w:b/>
+                          <w:bCs/>
+                          <w:sz w:val="40"/>
+                          <w:szCs w:val="40"/>
+                        </w:rPr>
+                        <w:t>6</w:t>
+                      </w:r>
+                      <w:r>
+                        <w:rPr>
+                          <w:rFonts w:ascii="Comic Sans MS" w:hAnsi="Comic Sans MS"/>
+                          <w:b/>
+                          <w:bCs/>
+                          <w:sz w:val="40"/>
+                          <w:szCs w:val="40"/>
+                        </w:rPr>
+                        <w:t>h</w:t>
+                      </w:r>
+                      <w:r>
+                        <w:rPr>
+                          <w:rFonts w:ascii="Comic Sans MS" w:hAnsi="Comic Sans MS"/>
+                          <w:b/>
+                          <w:bCs/>
+                          <w:sz w:val="40"/>
+                          <w:szCs w:val="40"/>
+                        </w:rPr>
+                        <w:t>30</w:t>
                       </w:r>
                     </w:p>
                   </w:txbxContent>
@@ -176,91 +416,6 @@
           </mc:Fallback>
         </mc:AlternateContent>
       </w:r>
-      <w:r>
-        <w:rPr>
-          <w:noProof/>
-        </w:rPr>
-        <w:drawing>
-          <wp:anchor distT="0" distB="0" distL="114300" distR="114300" simplePos="0" relativeHeight="251658240" behindDoc="1" locked="0" layoutInCell="1" allowOverlap="1" wp14:anchorId="171E41C9" wp14:editId="081F3719">
-            <wp:simplePos x="0" y="0"/>
-            <wp:positionH relativeFrom="page">
-              <wp:posOffset>-2540</wp:posOffset>
-            </wp:positionH>
-            <wp:positionV relativeFrom="paragraph">
-              <wp:posOffset>-201295</wp:posOffset>
-            </wp:positionV>
-            <wp:extent cx="7562850" cy="10688320"/>
-            <wp:effectExtent l="0" t="0" r="0" b="0"/>
-            <wp:wrapNone/>
-            <wp:docPr id="3" name="Image 3"/>
-            <wp:cNvGraphicFramePr>
-              <a:graphicFrameLocks xmlns:a="http://schemas.openxmlformats.org/drawingml/2006/main" noChangeAspect="1"/>
-            </wp:cNvGraphicFramePr>
-            <a:graphic xmlns:a="http://schemas.openxmlformats.org/drawingml/2006/main">
-              <a:graphicData uri="http://schemas.openxmlformats.org/drawingml/2006/picture">
-                <pic:pic xmlns:pic="http://schemas.openxmlformats.org/drawingml/2006/picture">
-                  <pic:nvPicPr>
-                    <pic:cNvPr id="3" name="Image 3"/>
-                    <pic:cNvPicPr/>
-                  </pic:nvPicPr>
-                  <pic:blipFill>
-                    <a:blip r:embed="rId6">
-                      <a:extLst>
-                        <a:ext uri="{28A0092B-C50C-407E-A947-70E740481C1C}">
-                          <a14:useLocalDpi xmlns:a14="http://schemas.microsoft.com/office/drawing/2010/main" val="0"/>
-                        </a:ext>
-                      </a:extLst>
-                    </a:blip>
-                    <a:stretch>
-                      <a:fillRect/>
-                    </a:stretch>
-                  </pic:blipFill>
-                  <pic:spPr>
-                    <a:xfrm>
-                      <a:off x="0" y="0"/>
-                      <a:ext cx="7562850" cy="10688320"/>
-                    </a:xfrm>
-                    <a:prstGeom prst="rect">
-                      <a:avLst/>
-                    </a:prstGeom>
-                  </pic:spPr>
-                </pic:pic>
-              </a:graphicData>
-            </a:graphic>
-            <wp14:sizeRelH relativeFrom="page">
-              <wp14:pctWidth>0</wp14:pctWidth>
-            </wp14:sizeRelH>
-            <wp14:sizeRelV relativeFrom="page">
-              <wp14:pctHeight>0</wp14:pctHeight>
-            </wp14:sizeRelV>
-          </wp:anchor>
-        </w:drawing>
-      </w:r>
-    </w:p>
-    <w:p>
-      <w:pPr>
-        <w:jc w:val="both"/>
-      </w:pPr>
-    </w:p>
-    <w:p>
-      <w:pPr>
-        <w:jc w:val="both"/>
-      </w:pPr>
-    </w:p>
-    <w:p>
-      <w:pPr>
-        <w:jc w:val="both"/>
-      </w:pPr>
-    </w:p>
-    <w:p>
-      <w:pPr>
-        <w:jc w:val="both"/>
-      </w:pPr>
-    </w:p>
-    <w:p>
-      <w:pPr>
-        <w:jc w:val="both"/>
-      </w:pPr>
       <w:r>
         <w:rPr>
           <w:noProof/>
@@ -357,7 +512,27 @@
                                 <w:sz w:val="28"/>
                                 <w:szCs w:val="28"/>
                               </w:rPr>
-                              <w:t>Américain saucisse</w:t>
+                              <w:t xml:space="preserve">Américain </w:t>
+                            </w:r>
+                            <w:r>
+                              <w:rPr>
+                                <w:rFonts w:ascii="Comic Sans MS" w:hAnsi="Comic Sans MS"/>
+                                <w:b/>
+                                <w:bCs/>
+                                <w:sz w:val="28"/>
+                                <w:szCs w:val="28"/>
+                              </w:rPr>
+                              <w:t>S</w:t>
+                            </w:r>
+                            <w:r>
+                              <w:rPr>
+                                <w:rFonts w:ascii="Comic Sans MS" w:hAnsi="Comic Sans MS"/>
+                                <w:b/>
+                                <w:bCs/>
+                                <w:sz w:val="28"/>
+                                <w:szCs w:val="28"/>
+                              </w:rPr>
+                              <w:t>aucisse</w:t>
                             </w:r>
                             <w:r>
                               <w:rPr>
@@ -379,18 +554,19 @@
                                 <w:szCs w:val="28"/>
                               </w:rPr>
                               <w:tab/>
-                            </w:r>
-                            <w:r>
-                              <w:rPr>
-                                <w:rFonts w:ascii="Comic Sans MS" w:hAnsi="Comic Sans MS"/>
-                                <w:b/>
-                                <w:bCs/>
-                                <w:sz w:val="28"/>
-                                <w:szCs w:val="28"/>
-                              </w:rPr>
                               <w:t>7€</w:t>
                             </w:r>
                             <w:bookmarkEnd w:id="0"/>
+                            <w:r>
+                              <w:rPr>
+                                <w:rFonts w:ascii="Comic Sans MS" w:hAnsi="Comic Sans MS"/>
+                                <w:b/>
+                                <w:bCs/>
+                                <w:sz w:val="28"/>
+                                <w:szCs w:val="28"/>
+                              </w:rPr>
+                              <w:t>50</w:t>
+                            </w:r>
                           </w:p>
                           <w:p>
                             <w:pPr>
@@ -416,7 +592,27 @@
                                 <w:sz w:val="28"/>
                                 <w:szCs w:val="28"/>
                               </w:rPr>
-                              <w:t>Américain merguez</w:t>
+                              <w:t xml:space="preserve">Américain </w:t>
+                            </w:r>
+                            <w:r>
+                              <w:rPr>
+                                <w:rFonts w:ascii="Comic Sans MS" w:hAnsi="Comic Sans MS"/>
+                                <w:b/>
+                                <w:bCs/>
+                                <w:sz w:val="28"/>
+                                <w:szCs w:val="28"/>
+                              </w:rPr>
+                              <w:t>M</w:t>
+                            </w:r>
+                            <w:r>
+                              <w:rPr>
+                                <w:rFonts w:ascii="Comic Sans MS" w:hAnsi="Comic Sans MS"/>
+                                <w:b/>
+                                <w:bCs/>
+                                <w:sz w:val="28"/>
+                                <w:szCs w:val="28"/>
+                              </w:rPr>
+                              <w:t>erguez</w:t>
                             </w:r>
                             <w:r>
                               <w:rPr>
@@ -437,16 +633,17 @@
                                 <w:szCs w:val="28"/>
                               </w:rPr>
                               <w:tab/>
-                            </w:r>
-                            <w:r>
-                              <w:rPr>
-                                <w:rFonts w:ascii="Comic Sans MS" w:hAnsi="Comic Sans MS"/>
-                                <w:b/>
-                                <w:bCs/>
-                                <w:sz w:val="28"/>
-                                <w:szCs w:val="28"/>
-                              </w:rPr>
                               <w:t>7€</w:t>
+                            </w:r>
+                            <w:r>
+                              <w:rPr>
+                                <w:rFonts w:ascii="Comic Sans MS" w:hAnsi="Comic Sans MS"/>
+                                <w:b/>
+                                <w:bCs/>
+                                <w:sz w:val="28"/>
+                                <w:szCs w:val="28"/>
+                              </w:rPr>
+                              <w:t>50</w:t>
                             </w:r>
                           </w:p>
                           <w:p>
@@ -496,6 +693,16 @@
                               <w:tab/>
                               <w:t>7€</w:t>
                             </w:r>
+                            <w:r>
+                              <w:rPr>
+                                <w:rFonts w:ascii="Comic Sans MS" w:hAnsi="Comic Sans MS"/>
+                                <w:b/>
+                                <w:bCs/>
+                                <w:sz w:val="28"/>
+                                <w:szCs w:val="28"/>
+                              </w:rPr>
+                              <w:t>50</w:t>
+                            </w:r>
                           </w:p>
                           <w:p>
                             <w:pPr>
@@ -563,6 +770,16 @@
                               </w:rPr>
                               <w:t>5€</w:t>
                             </w:r>
+                            <w:r>
+                              <w:rPr>
+                                <w:rFonts w:ascii="Comic Sans MS" w:hAnsi="Comic Sans MS"/>
+                                <w:b/>
+                                <w:bCs/>
+                                <w:sz w:val="28"/>
+                                <w:szCs w:val="28"/>
+                              </w:rPr>
+                              <w:t>50</w:t>
+                            </w:r>
                           </w:p>
                           <w:p>
                             <w:pPr>
@@ -588,7 +805,17 @@
                                 <w:sz w:val="28"/>
                                 <w:szCs w:val="28"/>
                               </w:rPr>
-                              <w:t>Frites Nuggets</w:t>
+                              <w:t xml:space="preserve">Frites </w:t>
+                            </w:r>
+                            <w:r>
+                              <w:rPr>
+                                <w:rFonts w:ascii="Comic Sans MS" w:hAnsi="Comic Sans MS"/>
+                                <w:b/>
+                                <w:bCs/>
+                                <w:sz w:val="28"/>
+                                <w:szCs w:val="28"/>
+                              </w:rPr>
+                              <w:t>Merguez</w:t>
                             </w:r>
                             <w:r>
                               <w:rPr>
@@ -629,6 +856,16 @@
                                 <w:szCs w:val="28"/>
                               </w:rPr>
                               <w:t>5€</w:t>
+                            </w:r>
+                            <w:r>
+                              <w:rPr>
+                                <w:rFonts w:ascii="Comic Sans MS" w:hAnsi="Comic Sans MS"/>
+                                <w:b/>
+                                <w:bCs/>
+                                <w:sz w:val="28"/>
+                                <w:szCs w:val="28"/>
+                              </w:rPr>
+                              <w:t>50</w:t>
                             </w:r>
                           </w:p>
                           <w:p>
@@ -655,7 +892,17 @@
                                 <w:sz w:val="28"/>
                                 <w:szCs w:val="28"/>
                               </w:rPr>
-                              <w:t>Frites Merguez</w:t>
+                              <w:t xml:space="preserve">Frites </w:t>
+                            </w:r>
+                            <w:r>
+                              <w:rPr>
+                                <w:rFonts w:ascii="Comic Sans MS" w:hAnsi="Comic Sans MS"/>
+                                <w:b/>
+                                <w:bCs/>
+                                <w:sz w:val="28"/>
+                                <w:szCs w:val="28"/>
+                              </w:rPr>
+                              <w:t>Fricadelle</w:t>
                             </w:r>
                             <w:r>
                               <w:rPr>
@@ -685,17 +932,17 @@
                                 <w:sz w:val="28"/>
                                 <w:szCs w:val="28"/>
                               </w:rPr>
-                              <w:tab/>
-                            </w:r>
-                            <w:r>
-                              <w:rPr>
-                                <w:rFonts w:ascii="Comic Sans MS" w:hAnsi="Comic Sans MS"/>
-                                <w:b/>
-                                <w:bCs/>
-                                <w:sz w:val="28"/>
-                                <w:szCs w:val="28"/>
-                              </w:rPr>
                               <w:t>5€</w:t>
+                            </w:r>
+                            <w:r>
+                              <w:rPr>
+                                <w:rFonts w:ascii="Comic Sans MS" w:hAnsi="Comic Sans MS"/>
+                                <w:b/>
+                                <w:bCs/>
+                                <w:sz w:val="28"/>
+                                <w:szCs w:val="28"/>
+                              </w:rPr>
+                              <w:t>50</w:t>
                             </w:r>
                           </w:p>
                           <w:p>
@@ -722,7 +969,17 @@
                                 <w:sz w:val="28"/>
                                 <w:szCs w:val="28"/>
                               </w:rPr>
-                              <w:t>Frites Fricadelle</w:t>
+                              <w:t>Frites</w:t>
+                            </w:r>
+                            <w:r>
+                              <w:rPr>
+                                <w:rFonts w:ascii="Comic Sans MS" w:hAnsi="Comic Sans MS"/>
+                                <w:b/>
+                                <w:bCs/>
+                                <w:sz w:val="28"/>
+                                <w:szCs w:val="28"/>
+                              </w:rPr>
+                              <w:t> Nuggets</w:t>
                             </w:r>
                             <w:r>
                               <w:rPr>
@@ -752,7 +1009,18 @@
                                 <w:sz w:val="28"/>
                                 <w:szCs w:val="28"/>
                               </w:rPr>
+                              <w:tab/>
                               <w:t>5€</w:t>
+                            </w:r>
+                            <w:r>
+                              <w:rPr>
+                                <w:rFonts w:ascii="Comic Sans MS" w:hAnsi="Comic Sans MS"/>
+                                <w:b/>
+                                <w:bCs/>
+                                <w:sz w:val="28"/>
+                                <w:szCs w:val="28"/>
+                              </w:rPr>
+                              <w:t>50</w:t>
                             </w:r>
                           </w:p>
                           <w:p>
@@ -820,7 +1088,7 @@
           </mc:Choice>
           <mc:Fallback>
             <w:pict>
-              <v:roundrect w14:anchorId="497E094C" id="_x0000_s1027" style="position:absolute;left:0;text-align:left;margin-left:262.5pt;margin-top:120.85pt;width:268.85pt;height:297.7pt;rotation:90;z-index:251664384;visibility:visible;mso-wrap-style:square;mso-width-percent:0;mso-height-percent:0;mso-wrap-distance-left:10.8pt;mso-wrap-distance-top:7.2pt;mso-wrap-distance-right:10.8pt;mso-wrap-distance-bottom:7.2pt;mso-position-horizontal:absolute;mso-position-horizontal-relative:margin;mso-position-vertical:absolute;mso-position-vertical-relative:margin;mso-width-percent:0;mso-height-percent:0;mso-width-relative:margin;mso-height-relative:margin;v-text-anchor:middle" arcsize="8541f" o:gfxdata="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" o:allowincell="f" fillcolor="white [3212]">
+              <v:roundrect w14:anchorId="497E094C" id="_x0000_s1027" style="position:absolute;left:0;text-align:left;margin-left:262.5pt;margin-top:120.85pt;width:268.85pt;height:297.7pt;rotation:90;z-index:251664384;visibility:visible;mso-wrap-style:square;mso-width-percent:0;mso-height-percent:0;mso-wrap-distance-left:10.8pt;mso-wrap-distance-top:7.2pt;mso-wrap-distance-right:10.8pt;mso-wrap-distance-bottom:7.2pt;mso-position-horizontal:absolute;mso-position-horizontal-relative:margin;mso-position-vertical:absolute;mso-position-vertical-relative:margin;mso-width-percent:0;mso-height-percent:0;mso-width-relative:margin;mso-height-relative:margin;v-text-anchor:middle" arcsize="8541f" o:gfxdata="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" o:allowincell="f" fillcolor="white [3212]">
                 <v:fill opacity="46003f"/>
                 <v:textbox>
                   <w:txbxContent>
@@ -869,7 +1137,27 @@
                           <w:sz w:val="28"/>
                           <w:szCs w:val="28"/>
                         </w:rPr>
-                        <w:t>Américain saucisse</w:t>
+                        <w:t xml:space="preserve">Américain </w:t>
+                      </w:r>
+                      <w:r>
+                        <w:rPr>
+                          <w:rFonts w:ascii="Comic Sans MS" w:hAnsi="Comic Sans MS"/>
+                          <w:b/>
+                          <w:bCs/>
+                          <w:sz w:val="28"/>
+                          <w:szCs w:val="28"/>
+                        </w:rPr>
+                        <w:t>S</w:t>
+                      </w:r>
+                      <w:r>
+                        <w:rPr>
+                          <w:rFonts w:ascii="Comic Sans MS" w:hAnsi="Comic Sans MS"/>
+                          <w:b/>
+                          <w:bCs/>
+                          <w:sz w:val="28"/>
+                          <w:szCs w:val="28"/>
+                        </w:rPr>
+                        <w:t>aucisse</w:t>
                       </w:r>
                       <w:r>
                         <w:rPr>
@@ -891,18 +1179,19 @@
                           <w:szCs w:val="28"/>
                         </w:rPr>
                         <w:tab/>
-                      </w:r>
-                      <w:r>
-                        <w:rPr>
-                          <w:rFonts w:ascii="Comic Sans MS" w:hAnsi="Comic Sans MS"/>
-                          <w:b/>
-                          <w:bCs/>
-                          <w:sz w:val="28"/>
-                          <w:szCs w:val="28"/>
-                        </w:rPr>
                         <w:t>7€</w:t>
                       </w:r>
                       <w:bookmarkEnd w:id="1"/>
+                      <w:r>
+                        <w:rPr>
+                          <w:rFonts w:ascii="Comic Sans MS" w:hAnsi="Comic Sans MS"/>
+                          <w:b/>
+                          <w:bCs/>
+                          <w:sz w:val="28"/>
+                          <w:szCs w:val="28"/>
+                        </w:rPr>
+                        <w:t>50</w:t>
+                      </w:r>
                     </w:p>
                     <w:p>
                       <w:pPr>
@@ -928,7 +1217,27 @@
                           <w:sz w:val="28"/>
                           <w:szCs w:val="28"/>
                         </w:rPr>
-                        <w:t>Américain merguez</w:t>
+                        <w:t xml:space="preserve">Américain </w:t>
+                      </w:r>
+                      <w:r>
+                        <w:rPr>
+                          <w:rFonts w:ascii="Comic Sans MS" w:hAnsi="Comic Sans MS"/>
+                          <w:b/>
+                          <w:bCs/>
+                          <w:sz w:val="28"/>
+                          <w:szCs w:val="28"/>
+                        </w:rPr>
+                        <w:t>M</w:t>
+                      </w:r>
+                      <w:r>
+                        <w:rPr>
+                          <w:rFonts w:ascii="Comic Sans MS" w:hAnsi="Comic Sans MS"/>
+                          <w:b/>
+                          <w:bCs/>
+                          <w:sz w:val="28"/>
+                          <w:szCs w:val="28"/>
+                        </w:rPr>
+                        <w:t>erguez</w:t>
                       </w:r>
                       <w:r>
                         <w:rPr>
@@ -949,16 +1258,17 @@
                           <w:szCs w:val="28"/>
                         </w:rPr>
                         <w:tab/>
-                      </w:r>
-                      <w:r>
-                        <w:rPr>
-                          <w:rFonts w:ascii="Comic Sans MS" w:hAnsi="Comic Sans MS"/>
-                          <w:b/>
-                          <w:bCs/>
-                          <w:sz w:val="28"/>
-                          <w:szCs w:val="28"/>
-                        </w:rPr>
                         <w:t>7€</w:t>
+                      </w:r>
+                      <w:r>
+                        <w:rPr>
+                          <w:rFonts w:ascii="Comic Sans MS" w:hAnsi="Comic Sans MS"/>
+                          <w:b/>
+                          <w:bCs/>
+                          <w:sz w:val="28"/>
+                          <w:szCs w:val="28"/>
+                        </w:rPr>
+                        <w:t>50</w:t>
                       </w:r>
                     </w:p>
                     <w:p>
@@ -1008,6 +1318,16 @@
                         <w:tab/>
                         <w:t>7€</w:t>
                       </w:r>
+                      <w:r>
+                        <w:rPr>
+                          <w:rFonts w:ascii="Comic Sans MS" w:hAnsi="Comic Sans MS"/>
+                          <w:b/>
+                          <w:bCs/>
+                          <w:sz w:val="28"/>
+                          <w:szCs w:val="28"/>
+                        </w:rPr>
+                        <w:t>50</w:t>
+                      </w:r>
                     </w:p>
                     <w:p>
                       <w:pPr>
@@ -1075,6 +1395,16 @@
                         </w:rPr>
                         <w:t>5€</w:t>
                       </w:r>
+                      <w:r>
+                        <w:rPr>
+                          <w:rFonts w:ascii="Comic Sans MS" w:hAnsi="Comic Sans MS"/>
+                          <w:b/>
+                          <w:bCs/>
+                          <w:sz w:val="28"/>
+                          <w:szCs w:val="28"/>
+                        </w:rPr>
+                        <w:t>50</w:t>
+                      </w:r>
                     </w:p>
                     <w:p>
                       <w:pPr>
@@ -1100,7 +1430,17 @@
                           <w:sz w:val="28"/>
                           <w:szCs w:val="28"/>
                         </w:rPr>
-                        <w:t>Frites Nuggets</w:t>
+                        <w:t xml:space="preserve">Frites </w:t>
+                      </w:r>
+                      <w:r>
+                        <w:rPr>
+                          <w:rFonts w:ascii="Comic Sans MS" w:hAnsi="Comic Sans MS"/>
+                          <w:b/>
+                          <w:bCs/>
+                          <w:sz w:val="28"/>
+                          <w:szCs w:val="28"/>
+                        </w:rPr>
+                        <w:t>Merguez</w:t>
                       </w:r>
                       <w:r>
                         <w:rPr>
@@ -1141,6 +1481,16 @@
                           <w:szCs w:val="28"/>
                         </w:rPr>
                         <w:t>5€</w:t>
+                      </w:r>
+                      <w:r>
+                        <w:rPr>
+                          <w:rFonts w:ascii="Comic Sans MS" w:hAnsi="Comic Sans MS"/>
+                          <w:b/>
+                          <w:bCs/>
+                          <w:sz w:val="28"/>
+                          <w:szCs w:val="28"/>
+                        </w:rPr>
+                        <w:t>50</w:t>
                       </w:r>
                     </w:p>
                     <w:p>
@@ -1167,7 +1517,17 @@
                           <w:sz w:val="28"/>
                           <w:szCs w:val="28"/>
                         </w:rPr>
-                        <w:t>Frites Merguez</w:t>
+                        <w:t xml:space="preserve">Frites </w:t>
+                      </w:r>
+                      <w:r>
+                        <w:rPr>
+                          <w:rFonts w:ascii="Comic Sans MS" w:hAnsi="Comic Sans MS"/>
+                          <w:b/>
+                          <w:bCs/>
+                          <w:sz w:val="28"/>
+                          <w:szCs w:val="28"/>
+                        </w:rPr>
+                        <w:t>Fricadelle</w:t>
                       </w:r>
                       <w:r>
                         <w:rPr>
@@ -1197,17 +1557,17 @@
                           <w:sz w:val="28"/>
                           <w:szCs w:val="28"/>
                         </w:rPr>
-                        <w:tab/>
-                      </w:r>
-                      <w:r>
-                        <w:rPr>
-                          <w:rFonts w:ascii="Comic Sans MS" w:hAnsi="Comic Sans MS"/>
-                          <w:b/>
-                          <w:bCs/>
-                          <w:sz w:val="28"/>
-                          <w:szCs w:val="28"/>
-                        </w:rPr>
                         <w:t>5€</w:t>
+                      </w:r>
+                      <w:r>
+                        <w:rPr>
+                          <w:rFonts w:ascii="Comic Sans MS" w:hAnsi="Comic Sans MS"/>
+                          <w:b/>
+                          <w:bCs/>
+                          <w:sz w:val="28"/>
+                          <w:szCs w:val="28"/>
+                        </w:rPr>
+                        <w:t>50</w:t>
                       </w:r>
                     </w:p>
                     <w:p>
@@ -1234,7 +1594,17 @@
                           <w:sz w:val="28"/>
                           <w:szCs w:val="28"/>
                         </w:rPr>
-                        <w:t>Frites Fricadelle</w:t>
+                        <w:t>Frites</w:t>
+                      </w:r>
+                      <w:r>
+                        <w:rPr>
+                          <w:rFonts w:ascii="Comic Sans MS" w:hAnsi="Comic Sans MS"/>
+                          <w:b/>
+                          <w:bCs/>
+                          <w:sz w:val="28"/>
+                          <w:szCs w:val="28"/>
+                        </w:rPr>
+                        <w:t> Nuggets</w:t>
                       </w:r>
                       <w:r>
                         <w:rPr>
@@ -1264,7 +1634,18 @@
                           <w:sz w:val="28"/>
                           <w:szCs w:val="28"/>
                         </w:rPr>
+                        <w:tab/>
                         <w:t>5€</w:t>
+                      </w:r>
+                      <w:r>
+                        <w:rPr>
+                          <w:rFonts w:ascii="Comic Sans MS" w:hAnsi="Comic Sans MS"/>
+                          <w:b/>
+                          <w:bCs/>
+                          <w:sz w:val="28"/>
+                          <w:szCs w:val="28"/>
+                        </w:rPr>
+                        <w:t>50</w:t>
                       </w:r>
                     </w:p>
                     <w:p>
@@ -1321,51 +1702,6 @@
           </mc:Fallback>
         </mc:AlternateContent>
       </w:r>
-    </w:p>
-    <w:p>
-      <w:pPr>
-        <w:jc w:val="both"/>
-      </w:pPr>
-    </w:p>
-    <w:p>
-      <w:pPr>
-        <w:jc w:val="both"/>
-      </w:pPr>
-    </w:p>
-    <w:p>
-      <w:pPr>
-        <w:jc w:val="both"/>
-      </w:pPr>
-    </w:p>
-    <w:p>
-      <w:pPr>
-        <w:jc w:val="both"/>
-      </w:pPr>
-    </w:p>
-    <w:p>
-      <w:pPr>
-        <w:jc w:val="both"/>
-      </w:pPr>
-    </w:p>
-    <w:p>
-      <w:pPr>
-        <w:jc w:val="both"/>
-      </w:pPr>
-    </w:p>
-    <w:p>
-      <w:pPr>
-        <w:jc w:val="both"/>
-      </w:pPr>
-    </w:p>
-    <w:p>
-      <w:pPr>
-        <w:jc w:val="both"/>
-      </w:pPr>
-    </w:p>
-    <w:p>
-      <w:pPr>
-        <w:jc w:val="both"/>
-      </w:pPr>
       <w:r>
         <w:rPr>
           <w:noProof/>
@@ -1598,7 +1934,7 @@
           </mc:Choice>
           <mc:Fallback>
             <w:pict>
-              <v:roundrect w14:anchorId="6BCE2F3F" id="_x0000_s1028" style="position:absolute;left:0;text-align:left;margin-left:0;margin-top:315.7pt;width:121.2pt;height:184.5pt;rotation:90;z-index:251668480;visibility:visible;mso-wrap-style:square;mso-width-percent:0;mso-height-percent:0;mso-wrap-distance-left:10.8pt;mso-wrap-distance-top:7.2pt;mso-wrap-distance-right:10.8pt;mso-wrap-distance-bottom:7.2pt;mso-position-horizontal:left;mso-position-horizontal-relative:margin;mso-position-vertical:absolute;mso-position-vertical-relative:margin;mso-width-percent:0;mso-height-percent:0;mso-width-relative:margin;mso-height-relative:margin;v-text-anchor:middle" arcsize="8541f" o:gfxdata="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" o:allowincell="f" fillcolor="white [3212]">
+              <v:roundrect w14:anchorId="6BCE2F3F" id="_x0000_s1028" style="position:absolute;left:0;text-align:left;margin-left:0;margin-top:315.7pt;width:121.2pt;height:184.5pt;rotation:90;z-index:251668480;visibility:visible;mso-wrap-style:square;mso-width-percent:0;mso-height-percent:0;mso-wrap-distance-left:10.8pt;mso-wrap-distance-top:7.2pt;mso-wrap-distance-right:10.8pt;mso-wrap-distance-bottom:7.2pt;mso-position-horizontal:left;mso-position-horizontal-relative:margin;mso-position-vertical:absolute;mso-position-vertical-relative:margin;mso-width-percent:0;mso-height-percent:0;mso-width-relative:margin;mso-height-relative:margin;v-text-anchor:middle" arcsize="8541f" o:gfxdata="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" o:allowincell="f" fillcolor="white [3212]">
                 <v:fill opacity="46003f"/>
                 <v:textbox>
                   <w:txbxContent>
@@ -1772,51 +2108,6 @@
           </mc:Fallback>
         </mc:AlternateContent>
       </w:r>
-    </w:p>
-    <w:p>
-      <w:pPr>
-        <w:jc w:val="both"/>
-      </w:pPr>
-    </w:p>
-    <w:p>
-      <w:pPr>
-        <w:jc w:val="both"/>
-      </w:pPr>
-    </w:p>
-    <w:p>
-      <w:pPr>
-        <w:jc w:val="both"/>
-      </w:pPr>
-    </w:p>
-    <w:p>
-      <w:pPr>
-        <w:jc w:val="both"/>
-      </w:pPr>
-    </w:p>
-    <w:p>
-      <w:pPr>
-        <w:jc w:val="both"/>
-      </w:pPr>
-    </w:p>
-    <w:p>
-      <w:pPr>
-        <w:jc w:val="both"/>
-      </w:pPr>
-    </w:p>
-    <w:p>
-      <w:pPr>
-        <w:jc w:val="both"/>
-      </w:pPr>
-    </w:p>
-    <w:p>
-      <w:pPr>
-        <w:jc w:val="both"/>
-      </w:pPr>
-    </w:p>
-    <w:p>
-      <w:pPr>
-        <w:jc w:val="both"/>
-      </w:pPr>
       <w:r>
         <w:rPr>
           <w:noProof/>
@@ -1824,7 +2115,7 @@
         <mc:AlternateContent>
           <mc:Choice Requires="wps">
             <w:drawing>
-              <wp:anchor distT="91440" distB="91440" distL="137160" distR="137160" simplePos="0" relativeHeight="251670528" behindDoc="0" locked="0" layoutInCell="0" allowOverlap="1" wp14:anchorId="1D283B83" wp14:editId="4A1AA232">
+              <wp:anchor distT="91440" distB="91440" distL="137160" distR="137160" simplePos="0" relativeHeight="251670528" behindDoc="0" locked="0" layoutInCell="0" allowOverlap="1" wp14:anchorId="1D283B83" wp14:editId="6FD3F05B">
                 <wp:simplePos x="0" y="0"/>
                 <wp:positionH relativeFrom="margin">
                   <wp:posOffset>3025775</wp:posOffset>
@@ -2006,126 +2297,6 @@
             </w:pict>
           </mc:Fallback>
         </mc:AlternateContent>
-      </w:r>
-      <w:r>
-        <w:rPr>
-          <w:noProof/>
-        </w:rPr>
-        <w:drawing>
-          <wp:anchor distT="0" distB="0" distL="114300" distR="114300" simplePos="0" relativeHeight="251672576" behindDoc="1" locked="0" layoutInCell="1" allowOverlap="1" wp14:anchorId="68D11E9D" wp14:editId="6AEB7B95">
-            <wp:simplePos x="0" y="0"/>
-            <wp:positionH relativeFrom="margin">
-              <wp:align>right</wp:align>
-            </wp:positionH>
-            <wp:positionV relativeFrom="paragraph">
-              <wp:posOffset>2815590</wp:posOffset>
-            </wp:positionV>
-            <wp:extent cx="1064260" cy="769620"/>
-            <wp:effectExtent l="0" t="0" r="2540" b="0"/>
-            <wp:wrapNone/>
-            <wp:docPr id="7" name="Image 7" descr="Une image contenant texte, fleur, Graphique, Police&#10;&#10;Description générée automatiquement"/>
-            <wp:cNvGraphicFramePr>
-              <a:graphicFrameLocks xmlns:a="http://schemas.openxmlformats.org/drawingml/2006/main" noChangeAspect="1"/>
-            </wp:cNvGraphicFramePr>
-            <a:graphic xmlns:a="http://schemas.openxmlformats.org/drawingml/2006/main">
-              <a:graphicData uri="http://schemas.openxmlformats.org/drawingml/2006/picture">
-                <pic:pic xmlns:pic="http://schemas.openxmlformats.org/drawingml/2006/picture">
-                  <pic:nvPicPr>
-                    <pic:cNvPr id="7" name="Image 7" descr="Une image contenant texte, fleur, Graphique, Police&#10;&#10;Description générée automatiquement"/>
-                    <pic:cNvPicPr/>
-                  </pic:nvPicPr>
-                  <pic:blipFill>
-                    <a:blip r:embed="rId7">
-                      <a:extLst>
-                        <a:ext uri="{28A0092B-C50C-407E-A947-70E740481C1C}">
-                          <a14:useLocalDpi xmlns:a14="http://schemas.microsoft.com/office/drawing/2010/main" val="0"/>
-                        </a:ext>
-                      </a:extLst>
-                    </a:blip>
-                    <a:stretch>
-                      <a:fillRect/>
-                    </a:stretch>
-                  </pic:blipFill>
-                  <pic:spPr>
-                    <a:xfrm>
-                      <a:off x="0" y="0"/>
-                      <a:ext cx="1064260" cy="769620"/>
-                    </a:xfrm>
-                    <a:prstGeom prst="rect">
-                      <a:avLst/>
-                    </a:prstGeom>
-                  </pic:spPr>
-                </pic:pic>
-              </a:graphicData>
-            </a:graphic>
-            <wp14:sizeRelH relativeFrom="page">
-              <wp14:pctWidth>0</wp14:pctWidth>
-            </wp14:sizeRelH>
-            <wp14:sizeRelV relativeFrom="page">
-              <wp14:pctHeight>0</wp14:pctHeight>
-            </wp14:sizeRelV>
-          </wp:anchor>
-        </w:drawing>
-      </w:r>
-      <w:r>
-        <w:rPr>
-          <w:noProof/>
-        </w:rPr>
-        <w:drawing>
-          <wp:anchor distT="0" distB="0" distL="114300" distR="114300" simplePos="0" relativeHeight="251671552" behindDoc="1" locked="0" layoutInCell="1" allowOverlap="1" wp14:anchorId="6EFD1B4B" wp14:editId="5D2F25C4">
-            <wp:simplePos x="0" y="0"/>
-            <wp:positionH relativeFrom="column">
-              <wp:posOffset>55880</wp:posOffset>
-            </wp:positionH>
-            <wp:positionV relativeFrom="paragraph">
-              <wp:posOffset>2794635</wp:posOffset>
-            </wp:positionV>
-            <wp:extent cx="750570" cy="750570"/>
-            <wp:effectExtent l="0" t="0" r="0" b="0"/>
-            <wp:wrapNone/>
-            <wp:docPr id="6" name="Image 6" descr="Une image contenant texte, logo, Police, symbole&#10;&#10;Description générée automatiquement"/>
-            <wp:cNvGraphicFramePr>
-              <a:graphicFrameLocks xmlns:a="http://schemas.openxmlformats.org/drawingml/2006/main" noChangeAspect="1"/>
-            </wp:cNvGraphicFramePr>
-            <a:graphic xmlns:a="http://schemas.openxmlformats.org/drawingml/2006/main">
-              <a:graphicData uri="http://schemas.openxmlformats.org/drawingml/2006/picture">
-                <pic:pic xmlns:pic="http://schemas.openxmlformats.org/drawingml/2006/picture">
-                  <pic:nvPicPr>
-                    <pic:cNvPr id="6" name="Image 6" descr="Une image contenant texte, logo, Police, symbole&#10;&#10;Description générée automatiquement"/>
-                    <pic:cNvPicPr/>
-                  </pic:nvPicPr>
-                  <pic:blipFill>
-                    <a:blip r:embed="rId8" cstate="print">
-                      <a:extLst>
-                        <a:ext uri="{28A0092B-C50C-407E-A947-70E740481C1C}">
-                          <a14:useLocalDpi xmlns:a14="http://schemas.microsoft.com/office/drawing/2010/main" val="0"/>
-                        </a:ext>
-                      </a:extLst>
-                    </a:blip>
-                    <a:stretch>
-                      <a:fillRect/>
-                    </a:stretch>
-                  </pic:blipFill>
-                  <pic:spPr>
-                    <a:xfrm>
-                      <a:off x="0" y="0"/>
-                      <a:ext cx="750570" cy="750570"/>
-                    </a:xfrm>
-                    <a:prstGeom prst="rect">
-                      <a:avLst/>
-                    </a:prstGeom>
-                  </pic:spPr>
-                </pic:pic>
-              </a:graphicData>
-            </a:graphic>
-            <wp14:sizeRelH relativeFrom="page">
-              <wp14:pctWidth>0</wp14:pctWidth>
-            </wp14:sizeRelH>
-            <wp14:sizeRelV relativeFrom="page">
-              <wp14:pctHeight>0</wp14:pctHeight>
-            </wp14:sizeRelV>
-          </wp:anchor>
-        </w:drawing>
       </w:r>
     </w:p>
     <w:sectPr>

</xml_diff>